<commit_message>
feat(whitepaper): upgrade publication layout to institutional editorial standard (PDF & DOCX)
</commit_message>
<xml_diff>
--- a/docs/PRISM_Situational_Awareness_Whitepaper.docx
+++ b/docs/PRISM_Situational_Awareness_Whitepaper.docx
@@ -4,44 +4,43 @@
   <w:body>
     <w:p>
       <w:pPr>
-        <w:spacing w:after="80"/>
+        <w:spacing w:before="240" w:after="80"/>
       </w:pPr>
       <w:r>
         <w:rPr>
-          <w:rFonts w:ascii="Arial" w:hAnsi="Arial"/>
+          <w:rFonts w:ascii="Georgia" w:hAnsi="Georgia"/>
           <w:b/>
           <w:color w:val="0F172A"/>
-          <w:sz w:val="40"/>
+          <w:sz w:val="44"/>
         </w:rPr>
         <w:t>SITUATIONAL AWARENESS IN THE AGE OF EVENT DERIVATIVES</w:t>
       </w:r>
     </w:p>
     <w:p>
       <w:pPr>
-        <w:spacing w:after="120"/>
+        <w:spacing w:after="200"/>
       </w:pPr>
       <w:r>
         <w:rPr>
-          <w:rFonts w:ascii="Arial" w:hAnsi="Arial"/>
-          <w:b/>
-          <w:color w:val="2563EB"/>
-          <w:sz w:val="23"/>
+          <w:rFonts w:ascii="Georgia" w:hAnsi="Georgia"/>
+          <w:i/>
+          <w:color w:val="475569"/>
+          <w:sz w:val="24"/>
         </w:rPr>
         <w:t>On Epistemic Sovereignty, the Collapse of Consensus Pricing, and the Necessity of Institutional Routing Architecture</w:t>
       </w:r>
     </w:p>
     <w:p>
       <w:pPr>
-        <w:spacing w:after="240"/>
+        <w:spacing w:after="320"/>
       </w:pPr>
       <w:r>
         <w:rPr>
-          <w:rFonts w:ascii="Arial" w:hAnsi="Arial"/>
-          <w:b/>
+          <w:rFonts w:ascii="Georgia" w:hAnsi="Georgia"/>
           <w:color w:val="64748B"/>
           <w:sz w:val="18"/>
         </w:rPr>
-        <w:t>By PRISM Technologies Inc.  |  Quantitative Research &amp; Systems Architecture  |  October 2026</w:t>
+        <w:t>PRISM Technologies Inc.   |   Quantitative Systems &amp; Macro Research   |   October 2026</w:t>
       </w:r>
     </w:p>
     <w:tbl>
@@ -51,27 +50,33 @@
         <w:tblLook w:firstColumn="1" w:firstRow="1" w:lastColumn="0" w:lastRow="0" w:noHBand="0" w:noVBand="1" w:val="04A0"/>
       </w:tblPr>
       <w:tblGrid>
-        <w:gridCol w:w="10080"/>
+        <w:gridCol w:w="9648"/>
       </w:tblGrid>
       <w:tr>
         <w:tc>
           <w:tcPr>
-            <w:tcW w:type="dxa" w:w="10080"/>
+            <w:tcW w:type="dxa" w:w="9648"/>
             <w:shd w:fill="F8FAFC"/>
             <w:tcMar>
-              <w:top w:w="140" w:type="dxa"/>
-              <w:bottom w:w="140" w:type="dxa"/>
-              <w:left w:w="200" w:type="dxa"/>
-              <w:right w:w="200" w:type="dxa"/>
+              <w:top w:w="160" w:type="dxa"/>
+              <w:bottom w:w="160" w:type="dxa"/>
+              <w:left w:w="220" w:type="dxa"/>
+              <w:right w:w="220" w:type="dxa"/>
             </w:tcMar>
+            <w:tcBorders>
+              <w:left w:val="single" w:sz="12" w:space="0" w:color="0F172A"/>
+              <w:top w:val="none"/>
+              <w:right w:val="none"/>
+              <w:bottom w:val="none"/>
+            </w:tcBorders>
           </w:tcPr>
           <w:p>
             <w:r>
               <w:rPr>
-                <w:rFonts w:ascii="Arial" w:hAnsi="Arial"/>
+                <w:rFonts w:ascii="Georgia" w:hAnsi="Georgia"/>
                 <w:i/>
                 <w:color w:val="334155"/>
-                <w:sz w:val="19"/>
+                <w:sz w:val="20"/>
               </w:rPr>
               <w:t>“The most contrarian thing of all is not to oppose the crowd, but to think for yourself. Yet when markets become liquid enough to price the future itself, truth ceases to be a philosophical pursuit—it becomes an engineering bottleneck.”</w:t>
               <w:br/>
@@ -84,7 +89,7 @@
     </w:tbl>
     <w:p>
       <w:pPr>
-        <w:spacing w:after="200"/>
+        <w:spacing w:after="240"/>
       </w:pPr>
     </w:p>
     <w:tbl>
@@ -94,18 +99,18 @@
         <w:tblLook w:firstColumn="1" w:firstRow="1" w:lastColumn="0" w:lastRow="0" w:noHBand="0" w:noVBand="1" w:val="04A0"/>
       </w:tblPr>
       <w:tblGrid>
-        <w:gridCol w:w="3360"/>
-        <w:gridCol w:w="3360"/>
-        <w:gridCol w:w="3360"/>
+        <w:gridCol w:w="3216"/>
+        <w:gridCol w:w="3216"/>
+        <w:gridCol w:w="3216"/>
       </w:tblGrid>
       <w:tr>
         <w:tc>
           <w:tcPr>
-            <w:tcW w:type="dxa" w:w="3360"/>
-            <w:shd w:fill="F1F5F9"/>
+            <w:tcW w:type="dxa" w:w="3216"/>
+            <w:shd w:fill="F8FAFC"/>
             <w:tcMar>
-              <w:top w:w="120" w:type="dxa"/>
-              <w:bottom w:w="120" w:type="dxa"/>
+              <w:top w:w="140" w:type="dxa"/>
+              <w:bottom w:w="140" w:type="dxa"/>
               <w:left w:w="140" w:type="dxa"/>
               <w:right w:w="140" w:type="dxa"/>
             </w:tcMar>
@@ -116,19 +121,19 @@
             </w:pPr>
             <w:r>
               <w:rPr>
-                <w:rFonts w:ascii="Arial" w:hAnsi="Arial"/>
+                <w:rFonts w:ascii="Georgia" w:hAnsi="Georgia"/>
                 <w:b/>
                 <w:color w:val="0F172A"/>
-                <w:sz w:val="24"/>
+                <w:sz w:val="26"/>
               </w:rPr>
               <w:t>296 bps</w:t>
               <w:br/>
             </w:r>
             <w:r>
               <w:rPr>
-                <w:rFonts w:ascii="Arial" w:hAnsi="Arial"/>
+                <w:rFonts w:ascii="Georgia" w:hAnsi="Georgia"/>
                 <w:color w:val="64748B"/>
-                <w:sz w:val="15"/>
+                <w:sz w:val="16"/>
               </w:rPr>
               <w:t>Systematic Alpha Burn on Unrouted Large Orders</w:t>
             </w:r>
@@ -136,11 +141,11 @@
         </w:tc>
         <w:tc>
           <w:tcPr>
-            <w:tcW w:type="dxa" w:w="3360"/>
-            <w:shd w:fill="F1F5F9"/>
+            <w:tcW w:type="dxa" w:w="3216"/>
+            <w:shd w:fill="F8FAFC"/>
             <w:tcMar>
-              <w:top w:w="120" w:type="dxa"/>
-              <w:bottom w:w="120" w:type="dxa"/>
+              <w:top w:w="140" w:type="dxa"/>
+              <w:bottom w:w="140" w:type="dxa"/>
               <w:left w:w="140" w:type="dxa"/>
               <w:right w:w="140" w:type="dxa"/>
             </w:tcMar>
@@ -151,19 +156,19 @@
             </w:pPr>
             <w:r>
               <w:rPr>
-                <w:rFonts w:ascii="Arial" w:hAnsi="Arial"/>
+                <w:rFonts w:ascii="Georgia" w:hAnsi="Georgia"/>
                 <w:b/>
                 <w:color w:val="0F172A"/>
-                <w:sz w:val="24"/>
+                <w:sz w:val="26"/>
               </w:rPr>
               <w:t>14.2 Seconds</w:t>
               <w:br/>
             </w:r>
             <w:r>
               <w:rPr>
-                <w:rFonts w:ascii="Arial" w:hAnsi="Arial"/>
+                <w:rFonts w:ascii="Georgia" w:hAnsi="Georgia"/>
                 <w:color w:val="64748B"/>
-                <w:sz w:val="15"/>
+                <w:sz w:val="16"/>
               </w:rPr>
               <w:t>Cross-Venue Latency Window Between Kalshi &amp; Poly</w:t>
             </w:r>
@@ -171,11 +176,11 @@
         </w:tc>
         <w:tc>
           <w:tcPr>
-            <w:tcW w:type="dxa" w:w="3360"/>
-            <w:shd w:fill="F1F5F9"/>
+            <w:tcW w:type="dxa" w:w="3216"/>
+            <w:shd w:fill="F8FAFC"/>
             <w:tcMar>
-              <w:top w:w="120" w:type="dxa"/>
-              <w:bottom w:w="120" w:type="dxa"/>
+              <w:top w:w="140" w:type="dxa"/>
+              <w:bottom w:w="140" w:type="dxa"/>
               <w:left w:w="140" w:type="dxa"/>
               <w:right w:w="140" w:type="dxa"/>
             </w:tcMar>
@@ -186,19 +191,19 @@
             </w:pPr>
             <w:r>
               <w:rPr>
-                <w:rFonts w:ascii="Arial" w:hAnsi="Arial"/>
+                <w:rFonts w:ascii="Georgia" w:hAnsi="Georgia"/>
                 <w:b/>
                 <w:color w:val="0F172A"/>
-                <w:sz w:val="24"/>
+                <w:sz w:val="26"/>
               </w:rPr>
               <w:t>19.7x</w:t>
               <w:br/>
             </w:r>
             <w:r>
               <w:rPr>
-                <w:rFonts w:ascii="Arial" w:hAnsi="Arial"/>
+                <w:rFonts w:ascii="Georgia" w:hAnsi="Georgia"/>
                 <w:color w:val="64748B"/>
-                <w:sz w:val="15"/>
+                <w:sz w:val="16"/>
               </w:rPr>
               <w:t>Alpha Preservation Multiple (Slippage Saved / Fee Paid)</w:t>
             </w:r>
@@ -208,11 +213,11 @@
       <w:tr>
         <w:tc>
           <w:tcPr>
-            <w:tcW w:type="dxa" w:w="3360"/>
-            <w:shd w:fill="F1F5F9"/>
+            <w:tcW w:type="dxa" w:w="3216"/>
+            <w:shd w:fill="F8FAFC"/>
             <w:tcMar>
-              <w:top w:w="120" w:type="dxa"/>
-              <w:bottom w:w="120" w:type="dxa"/>
+              <w:top w:w="140" w:type="dxa"/>
+              <w:bottom w:w="140" w:type="dxa"/>
               <w:left w:w="140" w:type="dxa"/>
               <w:right w:w="140" w:type="dxa"/>
             </w:tcMar>
@@ -223,19 +228,19 @@
             </w:pPr>
             <w:r>
               <w:rPr>
-                <w:rFonts w:ascii="Arial" w:hAnsi="Arial"/>
+                <w:rFonts w:ascii="Georgia" w:hAnsi="Georgia"/>
                 <w:b/>
                 <w:color w:val="0F172A"/>
-                <w:sz w:val="24"/>
+                <w:sz w:val="26"/>
               </w:rPr>
               <w:t>$320 Billion</w:t>
               <w:br/>
             </w:r>
             <w:r>
               <w:rPr>
-                <w:rFonts w:ascii="Arial" w:hAnsi="Arial"/>
+                <w:rFonts w:ascii="Georgia" w:hAnsi="Georgia"/>
                 <w:color w:val="64748B"/>
-                <w:sz w:val="15"/>
+                <w:sz w:val="16"/>
               </w:rPr>
               <w:t>Projected 2030 Epistemic Event Contract Notional</w:t>
             </w:r>
@@ -243,11 +248,11 @@
         </w:tc>
         <w:tc>
           <w:tcPr>
-            <w:tcW w:type="dxa" w:w="3360"/>
-            <w:shd w:fill="F1F5F9"/>
+            <w:tcW w:type="dxa" w:w="3216"/>
+            <w:shd w:fill="F8FAFC"/>
             <w:tcMar>
-              <w:top w:w="120" w:type="dxa"/>
-              <w:bottom w:w="120" w:type="dxa"/>
+              <w:top w:w="140" w:type="dxa"/>
+              <w:bottom w:w="140" w:type="dxa"/>
               <w:left w:w="140" w:type="dxa"/>
               <w:right w:w="140" w:type="dxa"/>
             </w:tcMar>
@@ -258,19 +263,19 @@
             </w:pPr>
             <w:r>
               <w:rPr>
-                <w:rFonts w:ascii="Arial" w:hAnsi="Arial"/>
+                <w:rFonts w:ascii="Georgia" w:hAnsi="Georgia"/>
                 <w:b/>
                 <w:color w:val="0F172A"/>
-                <w:sz w:val="24"/>
+                <w:sz w:val="26"/>
               </w:rPr>
-              <w:t>&lt; 0.5 Milliseconds</w:t>
+              <w:t>&lt; 0.50 ms</w:t>
               <w:br/>
             </w:r>
             <w:r>
               <w:rPr>
-                <w:rFonts w:ascii="Arial" w:hAnsi="Arial"/>
+                <w:rFonts w:ascii="Georgia" w:hAnsi="Georgia"/>
                 <w:color w:val="64748B"/>
-                <w:sz w:val="15"/>
+                <w:sz w:val="16"/>
               </w:rPr>
               <w:t>Equinix NY4 FPGA Atomic Parent-Order Split Path</w:t>
             </w:r>
@@ -278,11 +283,11 @@
         </w:tc>
         <w:tc>
           <w:tcPr>
-            <w:tcW w:type="dxa" w:w="3360"/>
-            <w:shd w:fill="F1F5F9"/>
+            <w:tcW w:type="dxa" w:w="3216"/>
+            <w:shd w:fill="F8FAFC"/>
             <w:tcMar>
-              <w:top w:w="120" w:type="dxa"/>
-              <w:bottom w:w="120" w:type="dxa"/>
+              <w:top w:w="140" w:type="dxa"/>
+              <w:bottom w:w="140" w:type="dxa"/>
               <w:left w:w="140" w:type="dxa"/>
               <w:right w:w="140" w:type="dxa"/>
             </w:tcMar>
@@ -293,19 +298,19 @@
             </w:pPr>
             <w:r>
               <w:rPr>
-                <w:rFonts w:ascii="Arial" w:hAnsi="Arial"/>
+                <w:rFonts w:ascii="Georgia" w:hAnsi="Georgia"/>
                 <w:b/>
                 <w:color w:val="0F172A"/>
-                <w:sz w:val="24"/>
+                <w:sz w:val="26"/>
               </w:rPr>
               <w:t>99.95%</w:t>
               <w:br/>
             </w:r>
             <w:r>
               <w:rPr>
-                <w:rFonts w:ascii="Arial" w:hAnsi="Arial"/>
+                <w:rFonts w:ascii="Georgia" w:hAnsi="Georgia"/>
                 <w:color w:val="64748B"/>
-                <w:sz w:val="15"/>
+                <w:sz w:val="16"/>
               </w:rPr>
               <w:t>Non-Custodial Multi-Venue Execution Uptime SLA</w:t>
             </w:r>
@@ -320,80 +325,80 @@
     </w:p>
     <w:p>
       <w:pPr>
-        <w:spacing w:before="280" w:after="120"/>
+        <w:spacing w:before="360" w:after="120"/>
       </w:pPr>
       <w:r>
         <w:rPr>
-          <w:rFonts w:ascii="Arial" w:hAnsi="Arial"/>
+          <w:rFonts w:ascii="Georgia" w:hAnsi="Georgia"/>
           <w:b/>
           <w:color w:val="0F172A"/>
-          <w:sz w:val="26"/>
+          <w:sz w:val="27"/>
         </w:rPr>
         <w:t>PROLOGUE: THE SOVEREIGN TRUTH PROBLEM</w:t>
       </w:r>
     </w:p>
     <w:p>
       <w:pPr>
-        <w:spacing w:after="120" w:line="276" w:lineRule="auto"/>
+        <w:spacing w:after="140" w:line="300" w:lineRule="auto"/>
       </w:pPr>
       <w:r>
         <w:rPr>
-          <w:rFonts w:ascii="Arial" w:hAnsi="Arial"/>
+          <w:rFonts w:ascii="Georgia" w:hAnsi="Georgia"/>
           <w:color w:val="1E293B"/>
-          <w:sz w:val="19"/>
+          <w:sz w:val="20"/>
         </w:rPr>
         <w:t>Most market participants—including senior partners at quantitative hedge funds, sovereign allocators, and regulators in Washington—are fundamentally blind to what prediction markets actually represent. They believe Polymarket and Kalshi are betting parlors. They view them as digital casinos for political gamblers and crypto natives.</w:t>
       </w:r>
     </w:p>
     <w:p>
       <w:pPr>
-        <w:spacing w:after="120" w:line="276" w:lineRule="auto"/>
+        <w:spacing w:after="140" w:line="300" w:lineRule="auto"/>
       </w:pPr>
       <w:r>
         <w:rPr>
-          <w:rFonts w:ascii="Arial" w:hAnsi="Arial"/>
+          <w:rFonts w:ascii="Georgia" w:hAnsi="Georgia"/>
           <w:color w:val="1E293B"/>
-          <w:sz w:val="19"/>
+          <w:sz w:val="20"/>
         </w:rPr>
         <w:t>This is a category error of historic proportions. What is occurring right before our eyes is the birth of epistemic infrastructure: a decentralized, multi-venue, continuous clearing pricing mechanism for global state transitions. Whether an aircraft carrier transits the Taiwan Strait, whether the Federal Reserve cuts rates by 50 basis points, whether a commercial fusion reactor achieves net energy gain, or whether an election collapses into civil contestation—these are no longer questions mediated by editorial boards, polling aggregators, or lagging macroeconomic surveys. They are tradeable binary payoff functions.</w:t>
       </w:r>
     </w:p>
     <w:p>
       <w:pPr>
-        <w:spacing w:after="120" w:line="276" w:lineRule="auto"/>
+        <w:spacing w:after="140" w:line="300" w:lineRule="auto"/>
       </w:pPr>
       <w:r>
         <w:rPr>
-          <w:rFonts w:ascii="Arial" w:hAnsi="Arial"/>
+          <w:rFonts w:ascii="Georgia" w:hAnsi="Georgia"/>
           <w:color w:val="1E293B"/>
-          <w:sz w:val="19"/>
+          <w:sz w:val="20"/>
         </w:rPr>
         <w:t>When information has a real-time clearing price, the traditional apparatus of consensus reality is rendered obsolete. However, this transition has exposed a catastrophic systemic failure: the global truth machine is cracked in half.</w:t>
       </w:r>
     </w:p>
     <w:p>
       <w:pPr>
-        <w:spacing w:before="280" w:after="120"/>
+        <w:spacing w:before="360" w:after="120"/>
       </w:pPr>
       <w:r>
         <w:rPr>
-          <w:rFonts w:ascii="Arial" w:hAnsi="Arial"/>
+          <w:rFonts w:ascii="Georgia" w:hAnsi="Georgia"/>
           <w:b/>
           <w:color w:val="0F172A"/>
-          <w:sz w:val="26"/>
+          <w:sz w:val="27"/>
         </w:rPr>
         <w:t>I. THE MICROSTRUCTURE CRISIS: THE 296 BPS EPISTEMIC TAX</w:t>
       </w:r>
     </w:p>
     <w:p>
       <w:pPr>
-        <w:spacing w:after="120" w:line="276" w:lineRule="auto"/>
+        <w:spacing w:after="140" w:line="300" w:lineRule="auto"/>
       </w:pPr>
       <w:r>
         <w:rPr>
-          <w:rFonts w:ascii="Arial" w:hAnsi="Arial"/>
+          <w:rFonts w:ascii="Georgia" w:hAnsi="Georgia"/>
           <w:color w:val="1E293B"/>
-          <w:sz w:val="19"/>
+          <w:sz w:val="20"/>
         </w:rPr>
         <w:t>As capital floods into event derivatives, market structure is fragmenting across mutually incompatible regulatory and technological walled gardens:</w:t>
       </w:r>
@@ -401,22 +406,22 @@
     <w:p>
       <w:pPr>
         <w:pStyle w:val="ListBullet"/>
-        <w:spacing w:after="80"/>
+        <w:spacing w:after="100" w:line="300" w:lineRule="auto"/>
       </w:pPr>
       <w:r>
         <w:rPr>
-          <w:rFonts w:ascii="Arial" w:hAnsi="Arial"/>
+          <w:rFonts w:ascii="Georgia" w:hAnsi="Georgia"/>
           <w:b/>
           <w:color w:val="0F172A"/>
-          <w:sz w:val="19"/>
+          <w:sz w:val="20"/>
         </w:rPr>
         <w:t xml:space="preserve">The Offshore Synthetic Order Book (Polymarket): </w:t>
       </w:r>
       <w:r>
         <w:rPr>
-          <w:rFonts w:ascii="Arial" w:hAnsi="Arial"/>
+          <w:rFonts w:ascii="Georgia" w:hAnsi="Georgia"/>
           <w:color w:val="1E293B"/>
-          <w:sz w:val="19"/>
+          <w:sz w:val="20"/>
         </w:rPr>
         <w:t>USDC collateral on Polygon PoS, CLOB matching, subjective UMA optimistic oracle resolution. High retail velocity, massive volume, profound capital inefficiency, zero prime brokerage connectivity.</w:t>
       </w:r>
@@ -424,22 +429,22 @@
     <w:p>
       <w:pPr>
         <w:pStyle w:val="ListBullet"/>
-        <w:spacing w:after="80"/>
+        <w:spacing w:after="100" w:line="300" w:lineRule="auto"/>
       </w:pPr>
       <w:r>
         <w:rPr>
-          <w:rFonts w:ascii="Arial" w:hAnsi="Arial"/>
+          <w:rFonts w:ascii="Georgia" w:hAnsi="Georgia"/>
           <w:b/>
           <w:color w:val="0F172A"/>
-          <w:sz w:val="19"/>
+          <w:sz w:val="20"/>
         </w:rPr>
         <w:t xml:space="preserve">The Domestic CFTC-Regulated Exchange (Kalshi): </w:t>
       </w:r>
       <w:r>
         <w:rPr>
-          <w:rFonts w:ascii="Arial" w:hAnsi="Arial"/>
+          <w:rFonts w:ascii="Georgia" w:hAnsi="Georgia"/>
           <w:color w:val="1E293B"/>
-          <w:sz w:val="19"/>
+          <w:sz w:val="20"/>
         </w:rPr>
         <w:t>Fedwire USD clearinghouse collateral, LedgerX clearing heritage, position limits, formal regulatory legalism. Safe for compliant American capital, but structurally starved of global non-US liquidity.</w:t>
       </w:r>
@@ -447,29 +452,29 @@
     <w:p>
       <w:pPr>
         <w:pStyle w:val="ListBullet"/>
-        <w:spacing w:after="80"/>
+        <w:spacing w:after="100" w:line="300" w:lineRule="auto"/>
       </w:pPr>
       <w:r>
         <w:rPr>
-          <w:rFonts w:ascii="Arial" w:hAnsi="Arial"/>
+          <w:rFonts w:ascii="Georgia" w:hAnsi="Georgia"/>
           <w:b/>
           <w:color w:val="0F172A"/>
-          <w:sz w:val="19"/>
+          <w:sz w:val="20"/>
         </w:rPr>
         <w:t xml:space="preserve">The Traditional Multi-Asset Incumbent (ForecastEx / IBKR): </w:t>
       </w:r>
       <w:r>
         <w:rPr>
-          <w:rFonts w:ascii="Arial" w:hAnsi="Arial"/>
+          <w:rFonts w:ascii="Georgia" w:hAnsi="Georgia"/>
           <w:color w:val="1E293B"/>
-          <w:sz w:val="19"/>
+          <w:sz w:val="20"/>
         </w:rPr>
         <w:t>Embedded within institutional prime brokerage, but hobbled by legacy T+1 execution pipelines and retail-centric brokerage interfaces.</w:t>
       </w:r>
     </w:p>
     <w:p>
       <w:pPr>
-        <w:spacing w:before="160" w:after="40"/>
+        <w:spacing w:before="200" w:after="40"/>
         <w:jc w:val="center"/>
       </w:pPr>
     </w:p>
@@ -477,7 +482,7 @@
       <w:r>
         <w:drawing>
           <wp:inline xmlns:a="http://schemas.openxmlformats.org/drawingml/2006/main" xmlns:pic="http://schemas.openxmlformats.org/drawingml/2006/picture">
-            <wp:extent cx="6217920" cy="3108960"/>
+            <wp:extent cx="6035040" cy="2896819"/>
             <wp:docPr id="1" name="Picture 1"/>
             <wp:cNvGraphicFramePr>
               <a:graphicFrameLocks noChangeAspect="1"/>
@@ -486,7 +491,7 @@
               <a:graphicData uri="http://schemas.openxmlformats.org/drawingml/2006/picture">
                 <pic:pic>
                   <pic:nvPicPr>
-                    <pic:cNvPr id="0" name="chart_divergence.png"/>
+                    <pic:cNvPr id="0" name="chart_divergence_editorial.png"/>
                     <pic:cNvPicPr/>
                   </pic:nvPicPr>
                   <pic:blipFill>
@@ -498,7 +503,7 @@
                   <pic:spPr>
                     <a:xfrm>
                       <a:off x="0" y="0"/>
-                      <a:ext cx="6217920" cy="3108960"/>
+                      <a:ext cx="6035040" cy="2896819"/>
                     </a:xfrm>
                     <a:prstGeom prst="rect"/>
                   </pic:spPr>
@@ -511,75 +516,75 @@
     </w:p>
     <w:p>
       <w:pPr>
-        <w:spacing w:after="200"/>
+        <w:spacing w:after="240"/>
         <w:jc w:val="center"/>
       </w:pPr>
       <w:r>
         <w:rPr>
-          <w:rFonts w:ascii="Arial" w:hAnsi="Arial"/>
+          <w:rFonts w:ascii="Georgia" w:hAnsi="Georgia"/>
           <w:i/>
           <w:color w:val="64748B"/>
-          <w:sz w:val="16"/>
+          <w:sz w:val="17"/>
         </w:rPr>
         <w:t>Figure 1: High-Frequency Tick-Level Cross-Venue Price Divergence during Macro Shock Event (Kalshi CLOB vs Polymarket CLOB). Shaded area represents 480 bps open arbitrage window persisting for 14.2 seconds.</w:t>
       </w:r>
     </w:p>
     <w:p>
       <w:pPr>
-        <w:spacing w:after="120" w:line="276" w:lineRule="auto"/>
+        <w:spacing w:after="140" w:line="300" w:lineRule="auto"/>
       </w:pPr>
       <w:r>
         <w:rPr>
-          <w:rFonts w:ascii="Arial" w:hAnsi="Arial"/>
+          <w:rFonts w:ascii="Georgia" w:hAnsi="Georgia"/>
           <w:color w:val="1E293B"/>
-          <w:sz w:val="19"/>
+          <w:sz w:val="20"/>
         </w:rPr>
         <w:t>When an event of geopolitical or macroeconomic consequence breaks, the clearing price of reality does not adjust simultaneously. On Kalshi, the probability of an emergency Fed rate cut re-prices from 57.6¢ to 62.4¢ in t = 2.5s driven by domestic electronic bankwires. On Polymarket, delayed by cross-chain bridging and oracle dispute latency, the exact same contract prints at 57.6¢ for 14.2 seconds. The peak spread is 480 basis points.</w:t>
       </w:r>
     </w:p>
     <w:p>
       <w:pPr>
-        <w:spacing w:after="120" w:line="276" w:lineRule="auto"/>
+        <w:spacing w:after="140" w:line="300" w:lineRule="auto"/>
       </w:pPr>
       <w:r>
         <w:rPr>
-          <w:rFonts w:ascii="Arial" w:hAnsi="Arial"/>
+          <w:rFonts w:ascii="Georgia" w:hAnsi="Georgia"/>
           <w:color w:val="1E293B"/>
-          <w:sz w:val="19"/>
+          <w:sz w:val="20"/>
         </w:rPr>
         <w:t>For a systematic fund attempting to execute $1,000,000 of directional risk, routing into a single venue results in catastrophic market impact: an average of 296 basis points burned simply crossing fragmented order books. This is not a liquidity shortage; it is an arbitrage routing failure.</w:t>
       </w:r>
     </w:p>
     <w:p>
       <w:pPr>
-        <w:spacing w:before="280" w:after="120"/>
+        <w:spacing w:before="360" w:after="120"/>
       </w:pPr>
       <w:r>
         <w:rPr>
-          <w:rFonts w:ascii="Arial" w:hAnsi="Arial"/>
+          <w:rFonts w:ascii="Georgia" w:hAnsi="Georgia"/>
           <w:b/>
           <w:color w:val="0F172A"/>
-          <w:sz w:val="26"/>
+          <w:sz w:val="27"/>
         </w:rPr>
         <w:t>II. EXECUTION SLIPPAGE &amp; THE LIQUIDITY SCALING LAW</w:t>
       </w:r>
     </w:p>
     <w:p>
       <w:pPr>
-        <w:spacing w:after="120" w:line="276" w:lineRule="auto"/>
+        <w:spacing w:after="140" w:line="300" w:lineRule="auto"/>
       </w:pPr>
       <w:r>
         <w:rPr>
-          <w:rFonts w:ascii="Arial" w:hAnsi="Arial"/>
+          <w:rFonts w:ascii="Georgia" w:hAnsi="Georgia"/>
           <w:color w:val="1E293B"/>
-          <w:sz w:val="19"/>
+          <w:sz w:val="20"/>
         </w:rPr>
         <w:t>In AI scaling, the Bitter Lesson dictates that general methods leveraging compute always triumph over handcrafted rules. In capital markets, an identical mathematical law holds: Capital clusters exclusively where execution slippage approaches zero.</w:t>
       </w:r>
     </w:p>
     <w:p>
       <w:pPr>
-        <w:spacing w:before="160" w:after="40"/>
+        <w:spacing w:before="200" w:after="40"/>
         <w:jc w:val="center"/>
       </w:pPr>
     </w:p>
@@ -587,7 +592,7 @@
       <w:r>
         <w:drawing>
           <wp:inline xmlns:a="http://schemas.openxmlformats.org/drawingml/2006/main" xmlns:pic="http://schemas.openxmlformats.org/drawingml/2006/picture">
-            <wp:extent cx="6217920" cy="2590800"/>
+            <wp:extent cx="6035040" cy="2414016"/>
             <wp:docPr id="2" name="Picture 2"/>
             <wp:cNvGraphicFramePr>
               <a:graphicFrameLocks noChangeAspect="1"/>
@@ -596,7 +601,7 @@
               <a:graphicData uri="http://schemas.openxmlformats.org/drawingml/2006/picture">
                 <pic:pic>
                   <pic:nvPicPr>
-                    <pic:cNvPr id="0" name="chart_slippage_and_scaling.png"/>
+                    <pic:cNvPr id="0" name="chart_slippage_and_scaling_editorial.png"/>
                     <pic:cNvPicPr/>
                   </pic:nvPicPr>
                   <pic:blipFill>
@@ -608,7 +613,7 @@
                   <pic:spPr>
                     <a:xfrm>
                       <a:off x="0" y="0"/>
-                      <a:ext cx="6217920" cy="2590800"/>
+                      <a:ext cx="6035040" cy="2414016"/>
                     </a:xfrm>
                     <a:prstGeom prst="rect"/>
                   </pic:spPr>
@@ -621,15 +626,15 @@
     </w:p>
     <w:p>
       <w:pPr>
-        <w:spacing w:after="200"/>
+        <w:spacing w:after="240"/>
         <w:jc w:val="center"/>
       </w:pPr>
       <w:r>
         <w:rPr>
-          <w:rFonts w:ascii="Arial" w:hAnsi="Arial"/>
+          <w:rFonts w:ascii="Georgia" w:hAnsi="Georgia"/>
           <w:i/>
           <w:color w:val="64748B"/>
-          <w:sz w:val="16"/>
+          <w:sz w:val="17"/>
         </w:rPr>
         <w:t>Figure 2: (Left) Execution Slippage Curve vs Notional Order Size: Single-Venue vs PRISM Atomic Smart Router. (Right) Global Event Derivatives Volume Scaling Law (2026 - 2030) with PRISM Routed Flow Capture.</w:t>
       </w:r>
@@ -639,32 +644,40 @@
         <w:tblW w:type="auto" w:w="0"/>
         <w:jc w:val="center"/>
         <w:tblLook w:firstColumn="1" w:firstRow="1" w:lastColumn="0" w:lastRow="0" w:noHBand="0" w:noVBand="1" w:val="04A0"/>
+        <w:tblBorders>
+          <w:top w:val="single" w:sz="6" w:space="0" w:color="0F172A"/>
+          <w:bottom w:val="single" w:sz="6" w:space="0" w:color="0F172A"/>
+          <w:insideH w:val="none"/>
+          <w:insideV w:val="none"/>
+          <w:left w:val="none"/>
+          <w:right w:val="none"/>
+        </w:tblBorders>
       </w:tblPr>
       <w:tblGrid>
-        <w:gridCol w:w="2520"/>
-        <w:gridCol w:w="2520"/>
-        <w:gridCol w:w="2520"/>
-        <w:gridCol w:w="2520"/>
+        <w:gridCol w:w="2412"/>
+        <w:gridCol w:w="2412"/>
+        <w:gridCol w:w="2412"/>
+        <w:gridCol w:w="2412"/>
       </w:tblGrid>
       <w:tr>
         <w:tc>
           <w:tcPr>
-            <w:tcW w:type="dxa" w:w="2520"/>
-            <w:shd w:fill="1E293B"/>
+            <w:tcW w:type="dxa" w:w="2412"/>
+            <w:shd w:fill="F1F5F9"/>
             <w:tcMar>
-              <w:top w:w="80" w:type="dxa"/>
-              <w:bottom w:w="80" w:type="dxa"/>
-              <w:left w:w="100" w:type="dxa"/>
-              <w:right w:w="100" w:type="dxa"/>
+              <w:top w:w="100" w:type="dxa"/>
+              <w:bottom w:w="100" w:type="dxa"/>
+              <w:left w:w="120" w:type="dxa"/>
+              <w:right w:w="120" w:type="dxa"/>
             </w:tcMar>
           </w:tcPr>
           <w:p>
             <w:r>
               <w:rPr>
-                <w:rFonts w:ascii="Arial" w:hAnsi="Arial"/>
+                <w:rFonts w:ascii="Georgia" w:hAnsi="Georgia"/>
                 <w:b/>
-                <w:color w:val="FFFFFF"/>
-                <w:sz w:val="17"/>
+                <w:color w:val="0F172A"/>
+                <w:sz w:val="18"/>
               </w:rPr>
               <w:t>Notional Order Size</w:t>
             </w:r>
@@ -672,22 +685,22 @@
         </w:tc>
         <w:tc>
           <w:tcPr>
-            <w:tcW w:type="dxa" w:w="2520"/>
-            <w:shd w:fill="1E293B"/>
+            <w:tcW w:type="dxa" w:w="2412"/>
+            <w:shd w:fill="F1F5F9"/>
             <w:tcMar>
-              <w:top w:w="80" w:type="dxa"/>
-              <w:bottom w:w="80" w:type="dxa"/>
-              <w:left w:w="100" w:type="dxa"/>
-              <w:right w:w="100" w:type="dxa"/>
+              <w:top w:w="100" w:type="dxa"/>
+              <w:bottom w:w="100" w:type="dxa"/>
+              <w:left w:w="120" w:type="dxa"/>
+              <w:right w:w="120" w:type="dxa"/>
             </w:tcMar>
           </w:tcPr>
           <w:p>
             <w:r>
               <w:rPr>
-                <w:rFonts w:ascii="Arial" w:hAnsi="Arial"/>
+                <w:rFonts w:ascii="Georgia" w:hAnsi="Georgia"/>
                 <w:b/>
-                <w:color w:val="FFFFFF"/>
-                <w:sz w:val="17"/>
+                <w:color w:val="0F172A"/>
+                <w:sz w:val="18"/>
               </w:rPr>
               <w:t>Single-Venue Fill</w:t>
             </w:r>
@@ -695,22 +708,22 @@
         </w:tc>
         <w:tc>
           <w:tcPr>
-            <w:tcW w:type="dxa" w:w="2520"/>
-            <w:shd w:fill="1E293B"/>
+            <w:tcW w:type="dxa" w:w="2412"/>
+            <w:shd w:fill="F1F5F9"/>
             <w:tcMar>
-              <w:top w:w="80" w:type="dxa"/>
-              <w:bottom w:w="80" w:type="dxa"/>
-              <w:left w:w="100" w:type="dxa"/>
-              <w:right w:w="100" w:type="dxa"/>
+              <w:top w:w="100" w:type="dxa"/>
+              <w:bottom w:w="100" w:type="dxa"/>
+              <w:left w:w="120" w:type="dxa"/>
+              <w:right w:w="120" w:type="dxa"/>
             </w:tcMar>
           </w:tcPr>
           <w:p>
             <w:r>
               <w:rPr>
-                <w:rFonts w:ascii="Arial" w:hAnsi="Arial"/>
+                <w:rFonts w:ascii="Georgia" w:hAnsi="Georgia"/>
                 <w:b/>
-                <w:color w:val="FFFFFF"/>
-                <w:sz w:val="17"/>
+                <w:color w:val="0F172A"/>
+                <w:sz w:val="18"/>
               </w:rPr>
               <w:t>PRISM Atomic Routed</w:t>
             </w:r>
@@ -718,22 +731,22 @@
         </w:tc>
         <w:tc>
           <w:tcPr>
-            <w:tcW w:type="dxa" w:w="2520"/>
-            <w:shd w:fill="1E293B"/>
+            <w:tcW w:type="dxa" w:w="2412"/>
+            <w:shd w:fill="F1F5F9"/>
             <w:tcMar>
-              <w:top w:w="80" w:type="dxa"/>
-              <w:bottom w:w="80" w:type="dxa"/>
-              <w:left w:w="100" w:type="dxa"/>
-              <w:right w:w="100" w:type="dxa"/>
+              <w:top w:w="100" w:type="dxa"/>
+              <w:bottom w:w="100" w:type="dxa"/>
+              <w:left w:w="120" w:type="dxa"/>
+              <w:right w:w="120" w:type="dxa"/>
             </w:tcMar>
           </w:tcPr>
           <w:p>
             <w:r>
               <w:rPr>
-                <w:rFonts w:ascii="Arial" w:hAnsi="Arial"/>
+                <w:rFonts w:ascii="Georgia" w:hAnsi="Georgia"/>
                 <w:b/>
-                <w:color w:val="FFFFFF"/>
-                <w:sz w:val="17"/>
+                <w:color w:val="0F172A"/>
+                <w:sz w:val="18"/>
               </w:rPr>
               <w:t>Net Alpha Preserved</w:t>
             </w:r>
@@ -743,22 +756,22 @@
       <w:tr>
         <w:tc>
           <w:tcPr>
-            <w:tcW w:type="dxa" w:w="2520"/>
-            <w:shd w:fill="F8FAFC"/>
+            <w:tcW w:type="dxa" w:w="2412"/>
+            <w:shd w:fill="FAFAFA"/>
             <w:tcMar>
-              <w:top w:w="60" w:type="dxa"/>
-              <w:bottom w:w="60" w:type="dxa"/>
-              <w:left w:w="100" w:type="dxa"/>
-              <w:right w:w="100" w:type="dxa"/>
+              <w:top w:w="80" w:type="dxa"/>
+              <w:bottom w:w="80" w:type="dxa"/>
+              <w:left w:w="120" w:type="dxa"/>
+              <w:right w:w="120" w:type="dxa"/>
             </w:tcMar>
           </w:tcPr>
           <w:p>
             <w:r>
               <w:rPr>
-                <w:rFonts w:ascii="Arial" w:hAnsi="Arial"/>
+                <w:rFonts w:ascii="Georgia" w:hAnsi="Georgia"/>
                 <w:b w:val="0"/>
                 <w:color w:val="0F172A"/>
-                <w:sz w:val="17"/>
+                <w:sz w:val="18"/>
               </w:rPr>
               <w:t>$25,000 USD</w:t>
             </w:r>
@@ -766,22 +779,22 @@
         </w:tc>
         <w:tc>
           <w:tcPr>
-            <w:tcW w:type="dxa" w:w="2520"/>
-            <w:shd w:fill="F8FAFC"/>
+            <w:tcW w:type="dxa" w:w="2412"/>
+            <w:shd w:fill="FAFAFA"/>
             <w:tcMar>
-              <w:top w:w="60" w:type="dxa"/>
-              <w:bottom w:w="60" w:type="dxa"/>
-              <w:left w:w="100" w:type="dxa"/>
-              <w:right w:w="100" w:type="dxa"/>
+              <w:top w:w="80" w:type="dxa"/>
+              <w:bottom w:w="80" w:type="dxa"/>
+              <w:left w:w="120" w:type="dxa"/>
+              <w:right w:w="120" w:type="dxa"/>
             </w:tcMar>
           </w:tcPr>
           <w:p>
             <w:r>
               <w:rPr>
-                <w:rFonts w:ascii="Arial" w:hAnsi="Arial"/>
+                <w:rFonts w:ascii="Georgia" w:hAnsi="Georgia"/>
                 <w:b w:val="0"/>
                 <w:color w:val="0F172A"/>
-                <w:sz w:val="17"/>
+                <w:sz w:val="18"/>
               </w:rPr>
               <w:t>18 bps</w:t>
             </w:r>
@@ -789,22 +802,22 @@
         </w:tc>
         <w:tc>
           <w:tcPr>
-            <w:tcW w:type="dxa" w:w="2520"/>
-            <w:shd w:fill="F8FAFC"/>
+            <w:tcW w:type="dxa" w:w="2412"/>
+            <w:shd w:fill="FAFAFA"/>
             <w:tcMar>
-              <w:top w:w="60" w:type="dxa"/>
-              <w:bottom w:w="60" w:type="dxa"/>
-              <w:left w:w="100" w:type="dxa"/>
-              <w:right w:w="100" w:type="dxa"/>
+              <w:top w:w="80" w:type="dxa"/>
+              <w:bottom w:w="80" w:type="dxa"/>
+              <w:left w:w="120" w:type="dxa"/>
+              <w:right w:w="120" w:type="dxa"/>
             </w:tcMar>
           </w:tcPr>
           <w:p>
             <w:r>
               <w:rPr>
-                <w:rFonts w:ascii="Arial" w:hAnsi="Arial"/>
+                <w:rFonts w:ascii="Georgia" w:hAnsi="Georgia"/>
                 <w:b w:val="0"/>
                 <w:color w:val="0F172A"/>
-                <w:sz w:val="17"/>
+                <w:sz w:val="18"/>
               </w:rPr>
               <w:t>3 bps</w:t>
             </w:r>
@@ -812,22 +825,22 @@
         </w:tc>
         <w:tc>
           <w:tcPr>
-            <w:tcW w:type="dxa" w:w="2520"/>
-            <w:shd w:fill="F8FAFC"/>
+            <w:tcW w:type="dxa" w:w="2412"/>
+            <w:shd w:fill="FAFAFA"/>
             <w:tcMar>
-              <w:top w:w="60" w:type="dxa"/>
-              <w:bottom w:w="60" w:type="dxa"/>
-              <w:left w:w="100" w:type="dxa"/>
-              <w:right w:w="100" w:type="dxa"/>
+              <w:top w:w="80" w:type="dxa"/>
+              <w:bottom w:w="80" w:type="dxa"/>
+              <w:left w:w="120" w:type="dxa"/>
+              <w:right w:w="120" w:type="dxa"/>
             </w:tcMar>
           </w:tcPr>
           <w:p>
             <w:r>
               <w:rPr>
-                <w:rFonts w:ascii="Arial" w:hAnsi="Arial"/>
+                <w:rFonts w:ascii="Georgia" w:hAnsi="Georgia"/>
                 <w:b/>
                 <w:color w:val="0F172A"/>
-                <w:sz w:val="17"/>
+                <w:sz w:val="18"/>
               </w:rPr>
               <w:t>15 bps (83.3%)</w:t>
             </w:r>
@@ -837,22 +850,22 @@
       <w:tr>
         <w:tc>
           <w:tcPr>
-            <w:tcW w:type="dxa" w:w="2520"/>
+            <w:tcW w:type="dxa" w:w="2412"/>
             <w:shd w:fill="FFFFFF"/>
             <w:tcMar>
-              <w:top w:w="60" w:type="dxa"/>
-              <w:bottom w:w="60" w:type="dxa"/>
-              <w:left w:w="100" w:type="dxa"/>
-              <w:right w:w="100" w:type="dxa"/>
+              <w:top w:w="80" w:type="dxa"/>
+              <w:bottom w:w="80" w:type="dxa"/>
+              <w:left w:w="120" w:type="dxa"/>
+              <w:right w:w="120" w:type="dxa"/>
             </w:tcMar>
           </w:tcPr>
           <w:p>
             <w:r>
               <w:rPr>
-                <w:rFonts w:ascii="Arial" w:hAnsi="Arial"/>
+                <w:rFonts w:ascii="Georgia" w:hAnsi="Georgia"/>
                 <w:b w:val="0"/>
                 <w:color w:val="0F172A"/>
-                <w:sz w:val="17"/>
+                <w:sz w:val="18"/>
               </w:rPr>
               <w:t>$100,000 USD</w:t>
             </w:r>
@@ -860,22 +873,22 @@
         </w:tc>
         <w:tc>
           <w:tcPr>
-            <w:tcW w:type="dxa" w:w="2520"/>
+            <w:tcW w:type="dxa" w:w="2412"/>
             <w:shd w:fill="FFFFFF"/>
             <w:tcMar>
-              <w:top w:w="60" w:type="dxa"/>
-              <w:bottom w:w="60" w:type="dxa"/>
-              <w:left w:w="100" w:type="dxa"/>
-              <w:right w:w="100" w:type="dxa"/>
+              <w:top w:w="80" w:type="dxa"/>
+              <w:bottom w:w="80" w:type="dxa"/>
+              <w:left w:w="120" w:type="dxa"/>
+              <w:right w:w="120" w:type="dxa"/>
             </w:tcMar>
           </w:tcPr>
           <w:p>
             <w:r>
               <w:rPr>
-                <w:rFonts w:ascii="Arial" w:hAnsi="Arial"/>
+                <w:rFonts w:ascii="Georgia" w:hAnsi="Georgia"/>
                 <w:b w:val="0"/>
                 <w:color w:val="0F172A"/>
-                <w:sz w:val="17"/>
+                <w:sz w:val="18"/>
               </w:rPr>
               <w:t>78 bps</w:t>
             </w:r>
@@ -883,22 +896,22 @@
         </w:tc>
         <w:tc>
           <w:tcPr>
-            <w:tcW w:type="dxa" w:w="2520"/>
+            <w:tcW w:type="dxa" w:w="2412"/>
             <w:shd w:fill="FFFFFF"/>
             <w:tcMar>
-              <w:top w:w="60" w:type="dxa"/>
-              <w:bottom w:w="60" w:type="dxa"/>
-              <w:left w:w="100" w:type="dxa"/>
-              <w:right w:w="100" w:type="dxa"/>
+              <w:top w:w="80" w:type="dxa"/>
+              <w:bottom w:w="80" w:type="dxa"/>
+              <w:left w:w="120" w:type="dxa"/>
+              <w:right w:w="120" w:type="dxa"/>
             </w:tcMar>
           </w:tcPr>
           <w:p>
             <w:r>
               <w:rPr>
-                <w:rFonts w:ascii="Arial" w:hAnsi="Arial"/>
+                <w:rFonts w:ascii="Georgia" w:hAnsi="Georgia"/>
                 <w:b w:val="0"/>
                 <w:color w:val="0F172A"/>
-                <w:sz w:val="17"/>
+                <w:sz w:val="18"/>
               </w:rPr>
               <w:t>11 bps</w:t>
             </w:r>
@@ -906,22 +919,22 @@
         </w:tc>
         <w:tc>
           <w:tcPr>
-            <w:tcW w:type="dxa" w:w="2520"/>
+            <w:tcW w:type="dxa" w:w="2412"/>
             <w:shd w:fill="FFFFFF"/>
             <w:tcMar>
-              <w:top w:w="60" w:type="dxa"/>
-              <w:bottom w:w="60" w:type="dxa"/>
-              <w:left w:w="100" w:type="dxa"/>
-              <w:right w:w="100" w:type="dxa"/>
+              <w:top w:w="80" w:type="dxa"/>
+              <w:bottom w:w="80" w:type="dxa"/>
+              <w:left w:w="120" w:type="dxa"/>
+              <w:right w:w="120" w:type="dxa"/>
             </w:tcMar>
           </w:tcPr>
           <w:p>
             <w:r>
               <w:rPr>
-                <w:rFonts w:ascii="Arial" w:hAnsi="Arial"/>
+                <w:rFonts w:ascii="Georgia" w:hAnsi="Georgia"/>
                 <w:b/>
                 <w:color w:val="0F172A"/>
-                <w:sz w:val="17"/>
+                <w:sz w:val="18"/>
               </w:rPr>
               <w:t>67 bps (85.9%)</w:t>
             </w:r>
@@ -931,22 +944,22 @@
       <w:tr>
         <w:tc>
           <w:tcPr>
-            <w:tcW w:type="dxa" w:w="2520"/>
-            <w:shd w:fill="F8FAFC"/>
+            <w:tcW w:type="dxa" w:w="2412"/>
+            <w:shd w:fill="FAFAFA"/>
             <w:tcMar>
-              <w:top w:w="60" w:type="dxa"/>
-              <w:bottom w:w="60" w:type="dxa"/>
-              <w:left w:w="100" w:type="dxa"/>
-              <w:right w:w="100" w:type="dxa"/>
+              <w:top w:w="80" w:type="dxa"/>
+              <w:bottom w:w="80" w:type="dxa"/>
+              <w:left w:w="120" w:type="dxa"/>
+              <w:right w:w="120" w:type="dxa"/>
             </w:tcMar>
           </w:tcPr>
           <w:p>
             <w:r>
               <w:rPr>
-                <w:rFonts w:ascii="Arial" w:hAnsi="Arial"/>
+                <w:rFonts w:ascii="Georgia" w:hAnsi="Georgia"/>
                 <w:b w:val="0"/>
                 <w:color w:val="0F172A"/>
-                <w:sz w:val="17"/>
+                <w:sz w:val="18"/>
               </w:rPr>
               <w:t>$500,000 USD</w:t>
             </w:r>
@@ -954,22 +967,22 @@
         </w:tc>
         <w:tc>
           <w:tcPr>
-            <w:tcW w:type="dxa" w:w="2520"/>
-            <w:shd w:fill="F8FAFC"/>
+            <w:tcW w:type="dxa" w:w="2412"/>
+            <w:shd w:fill="FAFAFA"/>
             <w:tcMar>
-              <w:top w:w="60" w:type="dxa"/>
-              <w:bottom w:w="60" w:type="dxa"/>
-              <w:left w:w="100" w:type="dxa"/>
-              <w:right w:w="100" w:type="dxa"/>
+              <w:top w:w="80" w:type="dxa"/>
+              <w:bottom w:w="80" w:type="dxa"/>
+              <w:left w:w="120" w:type="dxa"/>
+              <w:right w:w="120" w:type="dxa"/>
             </w:tcMar>
           </w:tcPr>
           <w:p>
             <w:r>
               <w:rPr>
-                <w:rFonts w:ascii="Arial" w:hAnsi="Arial"/>
+                <w:rFonts w:ascii="Georgia" w:hAnsi="Georgia"/>
                 <w:b w:val="0"/>
                 <w:color w:val="0F172A"/>
-                <w:sz w:val="17"/>
+                <w:sz w:val="18"/>
               </w:rPr>
               <w:t>215 bps</w:t>
             </w:r>
@@ -977,22 +990,22 @@
         </w:tc>
         <w:tc>
           <w:tcPr>
-            <w:tcW w:type="dxa" w:w="2520"/>
-            <w:shd w:fill="F8FAFC"/>
+            <w:tcW w:type="dxa" w:w="2412"/>
+            <w:shd w:fill="FAFAFA"/>
             <w:tcMar>
-              <w:top w:w="60" w:type="dxa"/>
-              <w:bottom w:w="60" w:type="dxa"/>
-              <w:left w:w="100" w:type="dxa"/>
-              <w:right w:w="100" w:type="dxa"/>
+              <w:top w:w="80" w:type="dxa"/>
+              <w:bottom w:w="80" w:type="dxa"/>
+              <w:left w:w="120" w:type="dxa"/>
+              <w:right w:w="120" w:type="dxa"/>
             </w:tcMar>
           </w:tcPr>
           <w:p>
             <w:r>
               <w:rPr>
-                <w:rFonts w:ascii="Arial" w:hAnsi="Arial"/>
+                <w:rFonts w:ascii="Georgia" w:hAnsi="Georgia"/>
                 <w:b w:val="0"/>
                 <w:color w:val="0F172A"/>
-                <w:sz w:val="17"/>
+                <w:sz w:val="18"/>
               </w:rPr>
               <w:t>28 bps</w:t>
             </w:r>
@@ -1000,22 +1013,22 @@
         </w:tc>
         <w:tc>
           <w:tcPr>
-            <w:tcW w:type="dxa" w:w="2520"/>
-            <w:shd w:fill="F8FAFC"/>
+            <w:tcW w:type="dxa" w:w="2412"/>
+            <w:shd w:fill="FAFAFA"/>
             <w:tcMar>
-              <w:top w:w="60" w:type="dxa"/>
-              <w:bottom w:w="60" w:type="dxa"/>
-              <w:left w:w="100" w:type="dxa"/>
-              <w:right w:w="100" w:type="dxa"/>
+              <w:top w:w="80" w:type="dxa"/>
+              <w:bottom w:w="80" w:type="dxa"/>
+              <w:left w:w="120" w:type="dxa"/>
+              <w:right w:w="120" w:type="dxa"/>
             </w:tcMar>
           </w:tcPr>
           <w:p>
             <w:r>
               <w:rPr>
-                <w:rFonts w:ascii="Arial" w:hAnsi="Arial"/>
+                <w:rFonts w:ascii="Georgia" w:hAnsi="Georgia"/>
                 <w:b/>
                 <w:color w:val="0F172A"/>
-                <w:sz w:val="17"/>
+                <w:sz w:val="18"/>
               </w:rPr>
               <w:t>187 bps (87.0%)</w:t>
             </w:r>
@@ -1025,22 +1038,22 @@
       <w:tr>
         <w:tc>
           <w:tcPr>
-            <w:tcW w:type="dxa" w:w="2520"/>
+            <w:tcW w:type="dxa" w:w="2412"/>
             <w:shd w:fill="FFFFFF"/>
             <w:tcMar>
-              <w:top w:w="60" w:type="dxa"/>
-              <w:bottom w:w="60" w:type="dxa"/>
-              <w:left w:w="100" w:type="dxa"/>
-              <w:right w:w="100" w:type="dxa"/>
+              <w:top w:w="80" w:type="dxa"/>
+              <w:bottom w:w="80" w:type="dxa"/>
+              <w:left w:w="120" w:type="dxa"/>
+              <w:right w:w="120" w:type="dxa"/>
             </w:tcMar>
           </w:tcPr>
           <w:p>
             <w:r>
               <w:rPr>
-                <w:rFonts w:ascii="Arial" w:hAnsi="Arial"/>
+                <w:rFonts w:ascii="Georgia" w:hAnsi="Georgia"/>
                 <w:b w:val="0"/>
                 <w:color w:val="0F172A"/>
-                <w:sz w:val="17"/>
+                <w:sz w:val="18"/>
               </w:rPr>
               <w:t>$1,000,000 USD</w:t>
             </w:r>
@@ -1048,22 +1061,22 @@
         </w:tc>
         <w:tc>
           <w:tcPr>
-            <w:tcW w:type="dxa" w:w="2520"/>
+            <w:tcW w:type="dxa" w:w="2412"/>
             <w:shd w:fill="FFFFFF"/>
             <w:tcMar>
-              <w:top w:w="60" w:type="dxa"/>
-              <w:bottom w:w="60" w:type="dxa"/>
-              <w:left w:w="100" w:type="dxa"/>
-              <w:right w:w="100" w:type="dxa"/>
+              <w:top w:w="80" w:type="dxa"/>
+              <w:bottom w:w="80" w:type="dxa"/>
+              <w:left w:w="120" w:type="dxa"/>
+              <w:right w:w="120" w:type="dxa"/>
             </w:tcMar>
           </w:tcPr>
           <w:p>
             <w:r>
               <w:rPr>
-                <w:rFonts w:ascii="Arial" w:hAnsi="Arial"/>
+                <w:rFonts w:ascii="Georgia" w:hAnsi="Georgia"/>
                 <w:b w:val="0"/>
                 <w:color w:val="0F172A"/>
-                <w:sz w:val="17"/>
+                <w:sz w:val="18"/>
               </w:rPr>
               <w:t>296 bps</w:t>
             </w:r>
@@ -1071,22 +1084,22 @@
         </w:tc>
         <w:tc>
           <w:tcPr>
-            <w:tcW w:type="dxa" w:w="2520"/>
+            <w:tcW w:type="dxa" w:w="2412"/>
             <w:shd w:fill="FFFFFF"/>
             <w:tcMar>
-              <w:top w:w="60" w:type="dxa"/>
-              <w:bottom w:w="60" w:type="dxa"/>
-              <w:left w:w="100" w:type="dxa"/>
-              <w:right w:w="100" w:type="dxa"/>
+              <w:top w:w="80" w:type="dxa"/>
+              <w:bottom w:w="80" w:type="dxa"/>
+              <w:left w:w="120" w:type="dxa"/>
+              <w:right w:w="120" w:type="dxa"/>
             </w:tcMar>
           </w:tcPr>
           <w:p>
             <w:r>
               <w:rPr>
-                <w:rFonts w:ascii="Arial" w:hAnsi="Arial"/>
+                <w:rFonts w:ascii="Georgia" w:hAnsi="Georgia"/>
                 <w:b w:val="0"/>
                 <w:color w:val="0F172A"/>
-                <w:sz w:val="17"/>
+                <w:sz w:val="18"/>
               </w:rPr>
               <w:t>42 bps</w:t>
             </w:r>
@@ -1094,22 +1107,22 @@
         </w:tc>
         <w:tc>
           <w:tcPr>
-            <w:tcW w:type="dxa" w:w="2520"/>
+            <w:tcW w:type="dxa" w:w="2412"/>
             <w:shd w:fill="FFFFFF"/>
             <w:tcMar>
-              <w:top w:w="60" w:type="dxa"/>
-              <w:bottom w:w="60" w:type="dxa"/>
-              <w:left w:w="100" w:type="dxa"/>
-              <w:right w:w="100" w:type="dxa"/>
+              <w:top w:w="80" w:type="dxa"/>
+              <w:bottom w:w="80" w:type="dxa"/>
+              <w:left w:w="120" w:type="dxa"/>
+              <w:right w:w="120" w:type="dxa"/>
             </w:tcMar>
           </w:tcPr>
           <w:p>
             <w:r>
               <w:rPr>
-                <w:rFonts w:ascii="Arial" w:hAnsi="Arial"/>
+                <w:rFonts w:ascii="Georgia" w:hAnsi="Georgia"/>
                 <w:b/>
                 <w:color w:val="0F172A"/>
-                <w:sz w:val="17"/>
+                <w:sz w:val="18"/>
               </w:rPr>
               <w:t>254 bps (85.8%)</w:t>
             </w:r>
@@ -1119,22 +1132,22 @@
       <w:tr>
         <w:tc>
           <w:tcPr>
-            <w:tcW w:type="dxa" w:w="2520"/>
-            <w:shd w:fill="F8FAFC"/>
+            <w:tcW w:type="dxa" w:w="2412"/>
+            <w:shd w:fill="FAFAFA"/>
             <w:tcMar>
-              <w:top w:w="60" w:type="dxa"/>
-              <w:bottom w:w="60" w:type="dxa"/>
-              <w:left w:w="100" w:type="dxa"/>
-              <w:right w:w="100" w:type="dxa"/>
+              <w:top w:w="80" w:type="dxa"/>
+              <w:bottom w:w="80" w:type="dxa"/>
+              <w:left w:w="120" w:type="dxa"/>
+              <w:right w:w="120" w:type="dxa"/>
             </w:tcMar>
           </w:tcPr>
           <w:p>
             <w:r>
               <w:rPr>
-                <w:rFonts w:ascii="Arial" w:hAnsi="Arial"/>
+                <w:rFonts w:ascii="Georgia" w:hAnsi="Georgia"/>
                 <w:b w:val="0"/>
                 <w:color w:val="0F172A"/>
-                <w:sz w:val="17"/>
+                <w:sz w:val="18"/>
               </w:rPr>
               <w:t>$5,000,000 USD</w:t>
             </w:r>
@@ -1142,22 +1155,22 @@
         </w:tc>
         <w:tc>
           <w:tcPr>
-            <w:tcW w:type="dxa" w:w="2520"/>
-            <w:shd w:fill="F8FAFC"/>
+            <w:tcW w:type="dxa" w:w="2412"/>
+            <w:shd w:fill="FAFAFA"/>
             <w:tcMar>
-              <w:top w:w="60" w:type="dxa"/>
-              <w:bottom w:w="60" w:type="dxa"/>
-              <w:left w:w="100" w:type="dxa"/>
-              <w:right w:w="100" w:type="dxa"/>
+              <w:top w:w="80" w:type="dxa"/>
+              <w:bottom w:w="80" w:type="dxa"/>
+              <w:left w:w="120" w:type="dxa"/>
+              <w:right w:w="120" w:type="dxa"/>
             </w:tcMar>
           </w:tcPr>
           <w:p>
             <w:r>
               <w:rPr>
-                <w:rFonts w:ascii="Arial" w:hAnsi="Arial"/>
+                <w:rFonts w:ascii="Georgia" w:hAnsi="Georgia"/>
                 <w:b w:val="0"/>
                 <w:color w:val="0F172A"/>
-                <w:sz w:val="17"/>
+                <w:sz w:val="18"/>
               </w:rPr>
               <w:t>610 bps</w:t>
             </w:r>
@@ -1165,22 +1178,22 @@
         </w:tc>
         <w:tc>
           <w:tcPr>
-            <w:tcW w:type="dxa" w:w="2520"/>
-            <w:shd w:fill="F8FAFC"/>
+            <w:tcW w:type="dxa" w:w="2412"/>
+            <w:shd w:fill="FAFAFA"/>
             <w:tcMar>
-              <w:top w:w="60" w:type="dxa"/>
-              <w:bottom w:w="60" w:type="dxa"/>
-              <w:left w:w="100" w:type="dxa"/>
-              <w:right w:w="100" w:type="dxa"/>
+              <w:top w:w="80" w:type="dxa"/>
+              <w:bottom w:w="80" w:type="dxa"/>
+              <w:left w:w="120" w:type="dxa"/>
+              <w:right w:w="120" w:type="dxa"/>
             </w:tcMar>
           </w:tcPr>
           <w:p>
             <w:r>
               <w:rPr>
-                <w:rFonts w:ascii="Arial" w:hAnsi="Arial"/>
+                <w:rFonts w:ascii="Georgia" w:hAnsi="Georgia"/>
                 <w:b w:val="0"/>
                 <w:color w:val="0F172A"/>
-                <w:sz w:val="17"/>
+                <w:sz w:val="18"/>
               </w:rPr>
               <w:t>92 bps</w:t>
             </w:r>
@@ -1188,22 +1201,22 @@
         </w:tc>
         <w:tc>
           <w:tcPr>
-            <w:tcW w:type="dxa" w:w="2520"/>
-            <w:shd w:fill="F8FAFC"/>
+            <w:tcW w:type="dxa" w:w="2412"/>
+            <w:shd w:fill="FAFAFA"/>
             <w:tcMar>
-              <w:top w:w="60" w:type="dxa"/>
-              <w:bottom w:w="60" w:type="dxa"/>
-              <w:left w:w="100" w:type="dxa"/>
-              <w:right w:w="100" w:type="dxa"/>
+              <w:top w:w="80" w:type="dxa"/>
+              <w:bottom w:w="80" w:type="dxa"/>
+              <w:left w:w="120" w:type="dxa"/>
+              <w:right w:w="120" w:type="dxa"/>
             </w:tcMar>
           </w:tcPr>
           <w:p>
             <w:r>
               <w:rPr>
-                <w:rFonts w:ascii="Arial" w:hAnsi="Arial"/>
+                <w:rFonts w:ascii="Georgia" w:hAnsi="Georgia"/>
                 <w:b/>
                 <w:color w:val="0F172A"/>
-                <w:sz w:val="17"/>
+                <w:sz w:val="18"/>
               </w:rPr>
               <w:t>518 bps (84.9%)</w:t>
             </w:r>
@@ -1218,53 +1231,53 @@
     </w:p>
     <w:p>
       <w:pPr>
-        <w:spacing w:after="120" w:line="276" w:lineRule="auto"/>
+        <w:spacing w:after="140" w:line="300" w:lineRule="auto"/>
       </w:pPr>
       <w:r>
         <w:rPr>
-          <w:rFonts w:ascii="Arial" w:hAnsi="Arial"/>
+          <w:rFonts w:ascii="Georgia" w:hAnsi="Georgia"/>
           <w:color w:val="1E293B"/>
-          <w:sz w:val="19"/>
+          <w:sz w:val="20"/>
         </w:rPr>
         <w:t>For every $1,000,000 routed through single-venue execution, a trading desk incurs $29,600 in market impact. With PRISM's atomic router, total slippage drops to $4,200. Even after paying PRISM’s 1.5 bps fee ($1,500), the desk retains $23,900 of pure alpha. The Client Alpha Preservation Ratio is 19.7x.</w:t>
       </w:r>
     </w:p>
     <w:p>
       <w:pPr>
-        <w:spacing w:before="280" w:after="120"/>
+        <w:spacing w:before="360" w:after="120"/>
       </w:pPr>
       <w:r>
         <w:rPr>
-          <w:rFonts w:ascii="Arial" w:hAnsi="Arial"/>
+          <w:rFonts w:ascii="Georgia" w:hAnsi="Georgia"/>
           <w:b/>
           <w:color w:val="0F172A"/>
-          <w:sz w:val="26"/>
+          <w:sz w:val="27"/>
         </w:rPr>
         <w:t>III. THE KARPIAN DOCTRINE: SOFTWARE AS SOVEREIGN UTILITY</w:t>
       </w:r>
     </w:p>
     <w:p>
       <w:pPr>
-        <w:spacing w:after="120" w:line="276" w:lineRule="auto"/>
+        <w:spacing w:after="140" w:line="300" w:lineRule="auto"/>
       </w:pPr>
       <w:r>
         <w:rPr>
-          <w:rFonts w:ascii="Arial" w:hAnsi="Arial"/>
+          <w:rFonts w:ascii="Georgia" w:hAnsi="Georgia"/>
           <w:color w:val="1E293B"/>
-          <w:sz w:val="19"/>
+          <w:sz w:val="20"/>
         </w:rPr>
         <w:t>Software does not exist to create frictionless social networks or optimize ad clicks; software exists to impose order upon chaotic, mission-critical environments where failure is existential. In institutional finance, execution quality is sovereignty.</w:t>
       </w:r>
     </w:p>
     <w:p>
       <w:pPr>
-        <w:spacing w:after="120" w:line="276" w:lineRule="auto"/>
+        <w:spacing w:after="140" w:line="300" w:lineRule="auto"/>
       </w:pPr>
       <w:r>
         <w:rPr>
-          <w:rFonts w:ascii="Arial" w:hAnsi="Arial"/>
+          <w:rFonts w:ascii="Georgia" w:hAnsi="Georgia"/>
           <w:color w:val="1E293B"/>
-          <w:sz w:val="19"/>
+          <w:sz w:val="20"/>
         </w:rPr>
         <w:t>If an institution cannot route an order across fragmented venues with sub-millisecond atomic certainty, they do not have an investment strategy—they are merely subsidizing toxic latency arbitrageurs who front-run their fills across the NY4 and AWS corridors. To solve this, PRISM operates on three sovereign design principles:</w:t>
       </w:r>
@@ -1272,22 +1285,22 @@
     <w:p>
       <w:pPr>
         <w:pStyle w:val="ListBullet"/>
-        <w:spacing w:after="80"/>
+        <w:spacing w:after="100" w:line="300" w:lineRule="auto"/>
       </w:pPr>
       <w:r>
         <w:rPr>
-          <w:rFonts w:ascii="Arial" w:hAnsi="Arial"/>
+          <w:rFonts w:ascii="Georgia" w:hAnsi="Georgia"/>
           <w:b/>
           <w:color w:val="0F172A"/>
-          <w:sz w:val="19"/>
+          <w:sz w:val="20"/>
         </w:rPr>
         <w:t xml:space="preserve">Sub-0.5ms Atomic Lot Splitting: </w:t>
       </w:r>
       <w:r>
         <w:rPr>
-          <w:rFonts w:ascii="Arial" w:hAnsi="Arial"/>
+          <w:rFonts w:ascii="Georgia" w:hAnsi="Georgia"/>
           <w:color w:val="1E293B"/>
-          <w:sz w:val="19"/>
+          <w:sz w:val="20"/>
         </w:rPr>
         <w:t>Dynamically decomposing parent orders into micro-lots across Kalshi and Polymarket using real-time tick-depth elasticity curves.</w:t>
       </w:r>
@@ -1295,22 +1308,22 @@
     <w:p>
       <w:pPr>
         <w:pStyle w:val="ListBullet"/>
-        <w:spacing w:after="80"/>
+        <w:spacing w:after="100" w:line="300" w:lineRule="auto"/>
       </w:pPr>
       <w:r>
         <w:rPr>
-          <w:rFonts w:ascii="Arial" w:hAnsi="Arial"/>
+          <w:rFonts w:ascii="Georgia" w:hAnsi="Georgia"/>
           <w:b/>
           <w:color w:val="0F172A"/>
-          <w:sz w:val="19"/>
+          <w:sz w:val="20"/>
         </w:rPr>
         <w:t xml:space="preserve">Deterministic Oracle Guard: </w:t>
       </w:r>
       <w:r>
         <w:rPr>
-          <w:rFonts w:ascii="Arial" w:hAnsi="Arial"/>
+          <w:rFonts w:ascii="Georgia" w:hAnsi="Georgia"/>
           <w:color w:val="1E293B"/>
-          <w:sz w:val="19"/>
+          <w:sz w:val="20"/>
         </w:rPr>
         <w:t>Algorithmic insulation against resolution discrepancies. When Kalshi settles based on official government reports and Polymarket settles via UMA token disputes, PRISM’s proprietary resolution matrix prices the divergence directly into execution.</w:t>
       </w:r>
@@ -1318,76 +1331,76 @@
     <w:p>
       <w:pPr>
         <w:pStyle w:val="ListBullet"/>
-        <w:spacing w:after="80"/>
+        <w:spacing w:after="100" w:line="300" w:lineRule="auto"/>
       </w:pPr>
       <w:r>
         <w:rPr>
-          <w:rFonts w:ascii="Arial" w:hAnsi="Arial"/>
+          <w:rFonts w:ascii="Georgia" w:hAnsi="Georgia"/>
           <w:b/>
           <w:color w:val="0F172A"/>
-          <w:sz w:val="19"/>
+          <w:sz w:val="20"/>
         </w:rPr>
         <w:t xml:space="preserve">Non-Custodial Isolation: </w:t>
       </w:r>
       <w:r>
         <w:rPr>
-          <w:rFonts w:ascii="Arial" w:hAnsi="Arial"/>
+          <w:rFonts w:ascii="Georgia" w:hAnsi="Georgia"/>
           <w:color w:val="1E293B"/>
-          <w:sz w:val="19"/>
+          <w:sz w:val="20"/>
         </w:rPr>
         <w:t>Capital never touches PRISM’s balance sheet. Institutional funds maintain bilateral custody at prime custodians. PRISM is purely the cryptographic, low-latency cerebral cortex.</w:t>
       </w:r>
     </w:p>
     <w:p>
       <w:pPr>
-        <w:spacing w:before="280" w:after="120"/>
+        <w:spacing w:before="360" w:after="120"/>
       </w:pPr>
       <w:r>
         <w:rPr>
-          <w:rFonts w:ascii="Arial" w:hAnsi="Arial"/>
+          <w:rFonts w:ascii="Georgia" w:hAnsi="Georgia"/>
           <w:b/>
           <w:color w:val="0F172A"/>
-          <w:sz w:val="26"/>
+          <w:sz w:val="27"/>
         </w:rPr>
         <w:t>IV. THE THIELIAN ANTITHESIS: COMPETITION IS FOR LOSERS</w:t>
       </w:r>
     </w:p>
     <w:p>
       <w:pPr>
-        <w:spacing w:after="120" w:line="276" w:lineRule="auto"/>
+        <w:spacing w:after="140" w:line="300" w:lineRule="auto"/>
       </w:pPr>
       <w:r>
         <w:rPr>
-          <w:rFonts w:ascii="Arial" w:hAnsi="Arial"/>
+          <w:rFonts w:ascii="Georgia" w:hAnsi="Georgia"/>
           <w:color w:val="1E293B"/>
-          <w:sz w:val="19"/>
+          <w:sz w:val="20"/>
         </w:rPr>
         <w:t>Every failed startup in this ecosystem is attempting to build 'another prediction exchange.' They are competing for retail users, hiring social media influencers, and burning venture capital acquiring retail gamblers who churn in 30 days. Competition is for losers. Monopolies are built by owning the invisible routing substrate through which all capital must flow.</w:t>
       </w:r>
     </w:p>
     <w:p>
       <w:pPr>
-        <w:spacing w:after="120" w:line="276" w:lineRule="auto"/>
+        <w:spacing w:after="140" w:line="300" w:lineRule="auto"/>
       </w:pPr>
       <w:r>
         <w:rPr>
-          <w:rFonts w:ascii="Arial" w:hAnsi="Arial"/>
+          <w:rFonts w:ascii="Georgia" w:hAnsi="Georgia"/>
           <w:color w:val="1E293B"/>
-          <w:sz w:val="19"/>
+          <w:sz w:val="20"/>
         </w:rPr>
         <w:t>PRISM does not care whether Polymarket wins, whether Kalshi wins, or whether ForecastEx dominates institutional volumes. PRISM is the critical utility toll booth sitting directly between the global hedge fund and every underlying execution venue on earth.</w:t>
       </w:r>
     </w:p>
     <w:p>
       <w:pPr>
-        <w:spacing w:before="280" w:after="120"/>
+        <w:spacing w:before="360" w:after="120"/>
       </w:pPr>
       <w:r>
         <w:rPr>
-          <w:rFonts w:ascii="Arial" w:hAnsi="Arial"/>
+          <w:rFonts w:ascii="Georgia" w:hAnsi="Georgia"/>
           <w:b/>
           <w:color w:val="0F172A"/>
-          <w:sz w:val="26"/>
+          <w:sz w:val="27"/>
         </w:rPr>
         <w:t>V. INSTITUTIONAL INTEGRATION SPECIFICATION</w:t>
       </w:r>
@@ -1397,30 +1410,38 @@
         <w:tblW w:type="auto" w:w="0"/>
         <w:jc w:val="center"/>
         <w:tblLook w:firstColumn="1" w:firstRow="1" w:lastColumn="0" w:lastRow="0" w:noHBand="0" w:noVBand="1" w:val="04A0"/>
+        <w:tblBorders>
+          <w:top w:val="single" w:sz="6" w:space="0" w:color="0F172A"/>
+          <w:bottom w:val="single" w:sz="6" w:space="0" w:color="0F172A"/>
+          <w:insideH w:val="none"/>
+          <w:insideV w:val="none"/>
+          <w:left w:val="none"/>
+          <w:right w:val="none"/>
+        </w:tblBorders>
       </w:tblPr>
       <w:tblGrid>
-        <w:gridCol w:w="5040"/>
-        <w:gridCol w:w="5040"/>
+        <w:gridCol w:w="4824"/>
+        <w:gridCol w:w="4824"/>
       </w:tblGrid>
       <w:tr>
         <w:tc>
           <w:tcPr>
-            <w:tcW w:type="dxa" w:w="5040"/>
-            <w:shd w:fill="F1F5F9"/>
+            <w:tcW w:type="dxa" w:w="4824"/>
+            <w:shd w:fill="F8FAFC"/>
             <w:tcMar>
-              <w:top w:w="60" w:type="dxa"/>
-              <w:bottom w:w="60" w:type="dxa"/>
-              <w:left w:w="100" w:type="dxa"/>
-              <w:right w:w="100" w:type="dxa"/>
+              <w:top w:w="70" w:type="dxa"/>
+              <w:bottom w:w="70" w:type="dxa"/>
+              <w:left w:w="120" w:type="dxa"/>
+              <w:right w:w="120" w:type="dxa"/>
             </w:tcMar>
           </w:tcPr>
           <w:p>
             <w:r>
               <w:rPr>
-                <w:rFonts w:ascii="Arial" w:hAnsi="Arial"/>
+                <w:rFonts w:ascii="Georgia" w:hAnsi="Georgia"/>
                 <w:b/>
                 <w:color w:val="0F172A"/>
-                <w:sz w:val="17"/>
+                <w:sz w:val="18"/>
               </w:rPr>
               <w:t>Interface Protocol</w:t>
             </w:r>
@@ -1428,21 +1449,21 @@
         </w:tc>
         <w:tc>
           <w:tcPr>
-            <w:tcW w:type="dxa" w:w="5040"/>
+            <w:tcW w:type="dxa" w:w="4824"/>
             <w:shd w:fill="FFFFFF"/>
             <w:tcMar>
-              <w:top w:w="60" w:type="dxa"/>
-              <w:bottom w:w="60" w:type="dxa"/>
-              <w:left w:w="100" w:type="dxa"/>
-              <w:right w:w="100" w:type="dxa"/>
+              <w:top w:w="70" w:type="dxa"/>
+              <w:bottom w:w="70" w:type="dxa"/>
+              <w:left w:w="120" w:type="dxa"/>
+              <w:right w:w="120" w:type="dxa"/>
             </w:tcMar>
           </w:tcPr>
           <w:p>
             <w:r>
               <w:rPr>
-                <w:rFonts w:ascii="Arial" w:hAnsi="Arial"/>
+                <w:rFonts w:ascii="Georgia" w:hAnsi="Georgia"/>
                 <w:color w:val="1E293B"/>
-                <w:sz w:val="17"/>
+                <w:sz w:val="18"/>
               </w:rPr>
               <w:t>FIX 4.4 Engine / Low-Latency REST / Streaming WebSocket</w:t>
             </w:r>
@@ -1452,22 +1473,22 @@
       <w:tr>
         <w:tc>
           <w:tcPr>
-            <w:tcW w:type="dxa" w:w="5040"/>
-            <w:shd w:fill="F1F5F9"/>
+            <w:tcW w:type="dxa" w:w="4824"/>
+            <w:shd w:fill="F8FAFC"/>
             <w:tcMar>
-              <w:top w:w="60" w:type="dxa"/>
-              <w:bottom w:w="60" w:type="dxa"/>
-              <w:left w:w="100" w:type="dxa"/>
-              <w:right w:w="100" w:type="dxa"/>
+              <w:top w:w="70" w:type="dxa"/>
+              <w:bottom w:w="70" w:type="dxa"/>
+              <w:left w:w="120" w:type="dxa"/>
+              <w:right w:w="120" w:type="dxa"/>
             </w:tcMar>
           </w:tcPr>
           <w:p>
             <w:r>
               <w:rPr>
-                <w:rFonts w:ascii="Arial" w:hAnsi="Arial"/>
+                <w:rFonts w:ascii="Georgia" w:hAnsi="Georgia"/>
                 <w:b/>
                 <w:color w:val="0F172A"/>
-                <w:sz w:val="17"/>
+                <w:sz w:val="18"/>
               </w:rPr>
               <w:t>Co-Location Datacenter</w:t>
             </w:r>
@@ -1475,23 +1496,23 @@
         </w:tc>
         <w:tc>
           <w:tcPr>
-            <w:tcW w:type="dxa" w:w="5040"/>
+            <w:tcW w:type="dxa" w:w="4824"/>
             <w:shd w:fill="FFFFFF"/>
             <w:tcMar>
-              <w:top w:w="60" w:type="dxa"/>
-              <w:bottom w:w="60" w:type="dxa"/>
-              <w:left w:w="100" w:type="dxa"/>
-              <w:right w:w="100" w:type="dxa"/>
+              <w:top w:w="70" w:type="dxa"/>
+              <w:bottom w:w="70" w:type="dxa"/>
+              <w:left w:w="120" w:type="dxa"/>
+              <w:right w:w="120" w:type="dxa"/>
             </w:tcMar>
           </w:tcPr>
           <w:p>
             <w:r>
               <w:rPr>
-                <w:rFonts w:ascii="Arial" w:hAnsi="Arial"/>
+                <w:rFonts w:ascii="Georgia" w:hAnsi="Georgia"/>
                 <w:color w:val="1E293B"/>
-                <w:sz w:val="17"/>
+                <w:sz w:val="18"/>
               </w:rPr>
-              <w:t>Equinix NY4 (Secaucus, NJ) • 10Gbps Cross-Connects</w:t>
+              <w:t>Equinix NY4 (Secaucus, NJ) • 10Gbps Dedicated Cross-Connects</w:t>
             </w:r>
           </w:p>
         </w:tc>
@@ -1499,22 +1520,22 @@
       <w:tr>
         <w:tc>
           <w:tcPr>
-            <w:tcW w:type="dxa" w:w="5040"/>
-            <w:shd w:fill="F1F5F9"/>
+            <w:tcW w:type="dxa" w:w="4824"/>
+            <w:shd w:fill="F8FAFC"/>
             <w:tcMar>
-              <w:top w:w="60" w:type="dxa"/>
-              <w:bottom w:w="60" w:type="dxa"/>
-              <w:left w:w="100" w:type="dxa"/>
-              <w:right w:w="100" w:type="dxa"/>
+              <w:top w:w="70" w:type="dxa"/>
+              <w:bottom w:w="70" w:type="dxa"/>
+              <w:left w:w="120" w:type="dxa"/>
+              <w:right w:w="120" w:type="dxa"/>
             </w:tcMar>
           </w:tcPr>
           <w:p>
             <w:r>
               <w:rPr>
-                <w:rFonts w:ascii="Arial" w:hAnsi="Arial"/>
+                <w:rFonts w:ascii="Georgia" w:hAnsi="Georgia"/>
                 <w:b/>
                 <w:color w:val="0F172A"/>
-                <w:sz w:val="17"/>
+                <w:sz w:val="18"/>
               </w:rPr>
               <w:t>Throughput Capacity</w:t>
             </w:r>
@@ -1522,23 +1543,23 @@
         </w:tc>
         <w:tc>
           <w:tcPr>
-            <w:tcW w:type="dxa" w:w="5040"/>
+            <w:tcW w:type="dxa" w:w="4824"/>
             <w:shd w:fill="FFFFFF"/>
             <w:tcMar>
-              <w:top w:w="60" w:type="dxa"/>
-              <w:bottom w:w="60" w:type="dxa"/>
-              <w:left w:w="100" w:type="dxa"/>
-              <w:right w:w="100" w:type="dxa"/>
+              <w:top w:w="70" w:type="dxa"/>
+              <w:bottom w:w="70" w:type="dxa"/>
+              <w:left w:w="120" w:type="dxa"/>
+              <w:right w:w="120" w:type="dxa"/>
             </w:tcMar>
           </w:tcPr>
           <w:p>
             <w:r>
               <w:rPr>
-                <w:rFonts w:ascii="Arial" w:hAnsi="Arial"/>
+                <w:rFonts w:ascii="Georgia" w:hAnsi="Georgia"/>
                 <w:color w:val="1E293B"/>
-                <w:sz w:val="17"/>
+                <w:sz w:val="18"/>
               </w:rPr>
-              <w:t>100,000 orders/sec burst capacity with deterministic lot routing</w:t>
+              <w:t>100,000 orders/sec burst capacity with deterministic micro-lot routing</w:t>
             </w:r>
           </w:p>
         </w:tc>
@@ -1546,22 +1567,22 @@
       <w:tr>
         <w:tc>
           <w:tcPr>
-            <w:tcW w:type="dxa" w:w="5040"/>
-            <w:shd w:fill="F1F5F9"/>
+            <w:tcW w:type="dxa" w:w="4824"/>
+            <w:shd w:fill="F8FAFC"/>
             <w:tcMar>
-              <w:top w:w="60" w:type="dxa"/>
-              <w:bottom w:w="60" w:type="dxa"/>
-              <w:left w:w="100" w:type="dxa"/>
-              <w:right w:w="100" w:type="dxa"/>
+              <w:top w:w="70" w:type="dxa"/>
+              <w:bottom w:w="70" w:type="dxa"/>
+              <w:left w:w="120" w:type="dxa"/>
+              <w:right w:w="120" w:type="dxa"/>
             </w:tcMar>
           </w:tcPr>
           <w:p>
             <w:r>
               <w:rPr>
-                <w:rFonts w:ascii="Arial" w:hAnsi="Arial"/>
+                <w:rFonts w:ascii="Georgia" w:hAnsi="Georgia"/>
                 <w:b/>
                 <w:color w:val="0F172A"/>
-                <w:sz w:val="17"/>
+                <w:sz w:val="18"/>
               </w:rPr>
               <w:t>Latency Execution SLA</w:t>
             </w:r>
@@ -1569,21 +1590,21 @@
         </w:tc>
         <w:tc>
           <w:tcPr>
-            <w:tcW w:type="dxa" w:w="5040"/>
+            <w:tcW w:type="dxa" w:w="4824"/>
             <w:shd w:fill="FFFFFF"/>
             <w:tcMar>
-              <w:top w:w="60" w:type="dxa"/>
-              <w:bottom w:w="60" w:type="dxa"/>
-              <w:left w:w="100" w:type="dxa"/>
-              <w:right w:w="100" w:type="dxa"/>
+              <w:top w:w="70" w:type="dxa"/>
+              <w:bottom w:w="70" w:type="dxa"/>
+              <w:left w:w="120" w:type="dxa"/>
+              <w:right w:w="120" w:type="dxa"/>
             </w:tcMar>
           </w:tcPr>
           <w:p>
             <w:r>
               <w:rPr>
-                <w:rFonts w:ascii="Arial" w:hAnsi="Arial"/>
+                <w:rFonts w:ascii="Georgia" w:hAnsi="Georgia"/>
                 <w:color w:val="1E293B"/>
-                <w:sz w:val="17"/>
+                <w:sz w:val="18"/>
               </w:rPr>
               <w:t>&lt; 0.50 Milliseconds internal matching &amp; transit engine</w:t>
             </w:r>
@@ -1593,22 +1614,22 @@
       <w:tr>
         <w:tc>
           <w:tcPr>
-            <w:tcW w:type="dxa" w:w="5040"/>
-            <w:shd w:fill="F1F5F9"/>
+            <w:tcW w:type="dxa" w:w="4824"/>
+            <w:shd w:fill="F8FAFC"/>
             <w:tcMar>
-              <w:top w:w="60" w:type="dxa"/>
-              <w:bottom w:w="60" w:type="dxa"/>
-              <w:left w:w="100" w:type="dxa"/>
-              <w:right w:w="100" w:type="dxa"/>
+              <w:top w:w="70" w:type="dxa"/>
+              <w:bottom w:w="70" w:type="dxa"/>
+              <w:left w:w="120" w:type="dxa"/>
+              <w:right w:w="120" w:type="dxa"/>
             </w:tcMar>
           </w:tcPr>
           <w:p>
             <w:r>
               <w:rPr>
-                <w:rFonts w:ascii="Arial" w:hAnsi="Arial"/>
+                <w:rFonts w:ascii="Georgia" w:hAnsi="Georgia"/>
                 <w:b/>
                 <w:color w:val="0F172A"/>
-                <w:sz w:val="17"/>
+                <w:sz w:val="18"/>
               </w:rPr>
               <w:t>Institutional Onboarding</w:t>
             </w:r>
@@ -1616,23 +1637,23 @@
         </w:tc>
         <w:tc>
           <w:tcPr>
-            <w:tcW w:type="dxa" w:w="5040"/>
+            <w:tcW w:type="dxa" w:w="4824"/>
             <w:shd w:fill="FFFFFF"/>
             <w:tcMar>
-              <w:top w:w="60" w:type="dxa"/>
-              <w:bottom w:w="60" w:type="dxa"/>
-              <w:left w:w="100" w:type="dxa"/>
-              <w:right w:w="100" w:type="dxa"/>
+              <w:top w:w="70" w:type="dxa"/>
+              <w:bottom w:w="70" w:type="dxa"/>
+              <w:left w:w="120" w:type="dxa"/>
+              <w:right w:w="120" w:type="dxa"/>
             </w:tcMar>
           </w:tcPr>
           <w:p>
             <w:r>
               <w:rPr>
-                <w:rFonts w:ascii="Arial" w:hAnsi="Arial"/>
+                <w:rFonts w:ascii="Georgia" w:hAnsi="Georgia"/>
                 <w:color w:val="1E293B"/>
-                <w:sz w:val="17"/>
+                <w:sz w:val="18"/>
               </w:rPr>
-              <w:t>Bespoke Sandbox API Keys: desk@prism.xyz</w:t>
+              <w:t>Bespoke Production Sandbox API Keys: desk@prism.xyz</w:t>
             </w:r>
           </w:p>
         </w:tc>
@@ -1646,19 +1667,19 @@
     <w:p>
       <w:r>
         <w:rPr>
-          <w:rFonts w:ascii="Arial" w:hAnsi="Arial"/>
+          <w:rFonts w:ascii="Georgia" w:hAnsi="Georgia"/>
           <w:b/>
           <w:color w:val="64748B"/>
           <w:sz w:val="17"/>
         </w:rPr>
-        <w:t>PRISM TECHNOLOGIES INC.  |  EXECUTION IS SOVEREIGNTY.</w:t>
+        <w:t>PRISM TECHNOLOGIES INC.   |   EXECUTION IS SOVEREIGNTY.</w:t>
         <w:br/>
-        <w:t>Secaucus NY4 • London LD4 • Singapore SG1  |  Contact: desk@prism.xyz</w:t>
+        <w:t>Secaucus NY4  •  London LD4  •  Singapore SG1   |   Contact: desk@prism.xyz</w:t>
       </w:r>
     </w:p>
     <w:sectPr>
       <w:pgSz w:w="12240" w:h="15840"/>
-      <w:pgMar w:top="1080" w:right="1080" w:bottom="1080" w:left="1080" w:header="720" w:footer="720" w:gutter="0"/>
+      <w:pgMar w:top="1296" w:right="1296" w:bottom="1296" w:left="1296" w:header="720" w:footer="720" w:gutter="0"/>
       <w:cols w:space="720"/>
       <w:docGrid w:linePitch="360"/>
     </w:sectPr>

</xml_diff>